<commit_message>
regenerate: BIOL-1 outputs after quiz rendering fix (PDFs, DOCX, slides, SVGs, captions); includes pre-existing SVG layout improvements from working tree
</commit_message>
<xml_diff>
--- a/PUBLISHED/biol-1/full_flat/module-01-study-of-life-practice-quiz.docx
+++ b/PUBLISHED/biol-1/full_flat/module-01-study-of-life-practice-quiz.docx
@@ -17,15 +17,19 @@
     </w:p>
     <w:p>
       <w:r>
-        <w:t xml:space="preserve">1. </w:t>
+        <w:t xml:space="preserve">• </w:t>
+      </w:r>
+      <w:r>
+        <w:br/>
       </w:r>
       <w:r>
         <w:t>A student sees frost crystals slowly "grow" on a cold window overnight. Why don't biologists count this as life?</w:t>
       </w:r>
-    </w:p>
-    <w:p>
       <w:r>
-        <w:t xml:space="preserve">2. </w:t>
+        <w:br/>
+      </w:r>
+      <w:r>
+        <w:br/>
       </w:r>
       <w:r>
         <w:t>A. Growth by itself is not enough; life needs cells, metabolism, response, and reproduction together.</w:t>
@@ -33,7 +37,10 @@
     </w:p>
     <w:p>
       <w:r>
-        <w:t xml:space="preserve">3. </w:t>
+        <w:t xml:space="preserve">• </w:t>
+      </w:r>
+      <w:r>
+        <w:br/>
       </w:r>
       <w:r>
         <w:t>B. Crystals are too small to be considered alive.</w:t>
@@ -41,7 +48,10 @@
     </w:p>
     <w:p>
       <w:r>
-        <w:t xml:space="preserve">4. </w:t>
+        <w:t xml:space="preserve">• </w:t>
+      </w:r>
+      <w:r>
+        <w:br/>
       </w:r>
       <w:r>
         <w:t>C. Crystals are never found in the natural world.</w:t>
@@ -49,7 +59,10 @@
     </w:p>
     <w:p>
       <w:r>
-        <w:t xml:space="preserve">5. </w:t>
+        <w:t xml:space="preserve">• </w:t>
+      </w:r>
+      <w:r>
+        <w:br/>
       </w:r>
       <w:r>
         <w:t>D. Only warm objects can ever be alive.</w:t>
@@ -57,7 +70,10 @@
     </w:p>
     <w:p>
       <w:r>
-        <w:t xml:space="preserve">6. </w:t>
+        <w:t xml:space="preserve">• </w:t>
+      </w:r>
+      <w:r>
+        <w:br/>
       </w:r>
       <w:r>
         <w:t>Answer: A</w:t>
@@ -65,7 +81,7 @@
     </w:p>
     <w:p>
       <w:r>
-        <w:t xml:space="preserve">7. </w:t>
+        <w:t xml:space="preserve">• </w:t>
       </w:r>
       <w:r>
         <w:br/>
@@ -73,13 +89,10 @@
       <w:r>
         <w:t>Why: No single trait defines life. Living things share a set of properties together: cells, metabolism, homeostasis, response, reproduction, and evolution.</w:t>
       </w:r>
-      <w:r>
-        <w:br/>
-      </w:r>
     </w:p>
     <w:p>
       <w:r>
-        <w:t xml:space="preserve">8. </w:t>
+        <w:t xml:space="preserve">• </w:t>
       </w:r>
       <w:r>
         <w:br/>
@@ -90,10 +103,8 @@
       <w:r>
         <w:br/>
       </w:r>
-    </w:p>
-    <w:p>
       <w:r>
-        <w:t xml:space="preserve">9. </w:t>
+        <w:br/>
       </w:r>
       <w:r>
         <w:t>A. hypothesis being tested</w:t>
@@ -101,7 +112,10 @@
     </w:p>
     <w:p>
       <w:r>
-        <w:t xml:space="preserve">10. </w:t>
+        <w:t xml:space="preserve">• </w:t>
+      </w:r>
+      <w:r>
+        <w:br/>
       </w:r>
       <w:r>
         <w:t>B. variable that is changed</w:t>
@@ -109,7 +123,10 @@
     </w:p>
     <w:p>
       <w:r>
-        <w:t xml:space="preserve">11. </w:t>
+        <w:t xml:space="preserve">• </w:t>
+      </w:r>
+      <w:r>
+        <w:br/>
       </w:r>
       <w:r>
         <w:t>C. final conclusion</w:t>
@@ -117,7 +134,10 @@
     </w:p>
     <w:p>
       <w:r>
-        <w:t xml:space="preserve">12. </w:t>
+        <w:t xml:space="preserve">• </w:t>
+      </w:r>
+      <w:r>
+        <w:br/>
       </w:r>
       <w:r>
         <w:t>D. supporting theory</w:t>
@@ -125,7 +145,10 @@
     </w:p>
     <w:p>
       <w:r>
-        <w:t xml:space="preserve">13. </w:t>
+        <w:t xml:space="preserve">• </w:t>
+      </w:r>
+      <w:r>
+        <w:br/>
       </w:r>
       <w:r>
         <w:t>Answer: B</w:t>
@@ -133,7 +156,7 @@
     </w:p>
     <w:p>
       <w:r>
-        <w:t xml:space="preserve">14. </w:t>
+        <w:t xml:space="preserve">• </w:t>
       </w:r>
       <w:r>
         <w:br/>
@@ -141,13 +164,10 @@
       <w:r>
         <w:t>Why: The variable is the factor that changes in an investigation. The hypothesis is the testable explanation, and the conclusion comes after the data.</w:t>
       </w:r>
-      <w:r>
-        <w:br/>
-      </w:r>
     </w:p>
     <w:p>
       <w:r>
-        <w:t xml:space="preserve">15. </w:t>
+        <w:t xml:space="preserve">• </w:t>
       </w:r>
       <w:r>
         <w:br/>
@@ -158,10 +178,8 @@
       <w:r>
         <w:br/>
       </w:r>
-    </w:p>
-    <w:p>
       <w:r>
-        <w:t xml:space="preserve">16. </w:t>
+        <w:br/>
       </w:r>
       <w:r>
         <w:t>A. Ecosystem, organism, cell</w:t>
@@ -169,7 +187,10 @@
     </w:p>
     <w:p>
       <w:r>
-        <w:t xml:space="preserve">17. </w:t>
+        <w:t xml:space="preserve">• </w:t>
+      </w:r>
+      <w:r>
+        <w:br/>
       </w:r>
       <w:r>
         <w:t>B. Organism, cell, molecule</w:t>
@@ -177,7 +198,10 @@
     </w:p>
     <w:p>
       <w:r>
-        <w:t xml:space="preserve">18. </w:t>
+        <w:t xml:space="preserve">• </w:t>
+      </w:r>
+      <w:r>
+        <w:br/>
       </w:r>
       <w:r>
         <w:t>C. Cell, organism, ecosystem</w:t>
@@ -185,7 +209,10 @@
     </w:p>
     <w:p>
       <w:r>
-        <w:t xml:space="preserve">19. </w:t>
+        <w:t xml:space="preserve">• </w:t>
+      </w:r>
+      <w:r>
+        <w:br/>
       </w:r>
       <w:r>
         <w:t>D. Population, cell, molecule</w:t>
@@ -193,7 +220,10 @@
     </w:p>
     <w:p>
       <w:r>
-        <w:t xml:space="preserve">20. </w:t>
+        <w:t xml:space="preserve">• </w:t>
+      </w:r>
+      <w:r>
+        <w:br/>
       </w:r>
       <w:r>
         <w:t>Answer: C</w:t>
@@ -201,7 +231,7 @@
     </w:p>
     <w:p>
       <w:r>
-        <w:t xml:space="preserve">21. </w:t>
+        <w:t xml:space="preserve">• </w:t>
       </w:r>
       <w:r>
         <w:br/>
@@ -209,13 +239,10 @@
       <w:r>
         <w:t>Why: Biology is organized across scales: cells build organisms, which form populations and ecosystems.</w:t>
       </w:r>
-      <w:r>
-        <w:br/>
-      </w:r>
     </w:p>
     <w:p>
       <w:r>
-        <w:t xml:space="preserve">22. </w:t>
+        <w:t xml:space="preserve">• </w:t>
       </w:r>
       <w:r>
         <w:br/>
@@ -226,10 +253,8 @@
       <w:r>
         <w:br/>
       </w:r>
-    </w:p>
-    <w:p>
       <w:r>
-        <w:t xml:space="preserve">23. </w:t>
+        <w:br/>
       </w:r>
       <w:r>
         <w:t>A. It becomes a fixed fact that can never change.</w:t>
@@ -237,7 +262,10 @@
     </w:p>
     <w:p>
       <w:r>
-        <w:t xml:space="preserve">24. </w:t>
+        <w:t xml:space="preserve">• </w:t>
+      </w:r>
+      <w:r>
+        <w:br/>
       </w:r>
       <w:r>
         <w:t>B. It should be hidden so no one can disprove it.</w:t>
@@ -245,7 +273,10 @@
     </w:p>
     <w:p>
       <w:r>
-        <w:t xml:space="preserve">25. </w:t>
+        <w:t xml:space="preserve">• </w:t>
+      </w:r>
+      <w:r>
+        <w:br/>
       </w:r>
       <w:r>
         <w:t>C. It must be discarded simply because it is old.</w:t>
@@ -253,7 +284,10 @@
     </w:p>
     <w:p>
       <w:r>
-        <w:t xml:space="preserve">26. </w:t>
+        <w:t xml:space="preserve">• </w:t>
+      </w:r>
+      <w:r>
+        <w:br/>
       </w:r>
       <w:r>
         <w:t>D. It may contribute evidence to a broader theory, but hypotheses and theories are different kinds of scientific explanation.</w:t>
@@ -261,7 +295,10 @@
     </w:p>
     <w:p>
       <w:r>
-        <w:t xml:space="preserve">27. </w:t>
+        <w:t xml:space="preserve">• </w:t>
+      </w:r>
+      <w:r>
+        <w:br/>
       </w:r>
       <w:r>
         <w:t>Answer: D</w:t>
@@ -269,7 +306,10 @@
     </w:p>
     <w:p>
       <w:r>
-        <w:t xml:space="preserve">28. </w:t>
+        <w:t xml:space="preserve">• </w:t>
+      </w:r>
+      <w:r>
+        <w:br/>
       </w:r>
       <w:r>
         <w:t>Why: A hypothesis is a testable explanation for a specific observation or pattern. A theory is a broad explanation supported by many lines of evidence; a hypothesis does not simply mature into a theory. Both remain open to revision when new evidence appears.</w:t>

</xml_diff>